<commit_message>
Update methodology docs, test data, and add APA report/brain figure generators
Co-authored-by: Copilot <223556219+Copilot@users.noreply.github.com>
</commit_message>
<xml_diff>
--- a/METHOD.docx
+++ b/METHOD.docx
@@ -69,168 +69,15 @@
         <w:jc w:val="both"/>
       </w:pPr>
       <w:r>
-        <w:t xml:space="preserve">A baseline adjustment was performed to account for individual differences in initial PLI values. The mean PLI value from the first </w:t>
-      </w:r>
-      <w:proofErr w:type="gramStart"/>
-      <w:r>
-        <w:t>session (‘</w:t>
-      </w:r>
-      <w:proofErr w:type="gramEnd"/>
-      <w:r>
-        <w:t>Pre’) was calculated for each participant, network, and frequency band. This baseline value was then included as a covariate in the statistical model. Consequently, the ‘Pre’ session data was excluded from the main analysis of session effects.</w:t>
+        <w:t>A baseline adjustment was performed to account for individual differences in initial PLI values. The mean PLI value from the first session (‘Pre’) was calculated for each participant, network, and frequency band. This baseline value was then included as a covariate in the statistical model. Consequently, the ‘Pre’ session data was excluded from the main analysis of session effects.</w:t>
       </w:r>
     </w:p>
     <w:p>
       <w:pPr>
-        <w:pStyle w:val="Heading4"/>
+        <w:pStyle w:val="FirstParagraph"/>
       </w:pPr>
       <w:bookmarkStart w:id="2" w:name="statistical-analysis"/>
       <w:bookmarkEnd w:id="1"/>
-      <w:r>
-        <w:rPr>
-          <w:b/>
-          <w:bCs/>
-        </w:rPr>
-        <w:t>Statistical Analysis</w:t>
-      </w:r>
-    </w:p>
-    <w:p>
-      <w:pPr>
-        <w:pStyle w:val="FirstParagraph"/>
-      </w:pPr>
-      <w:r>
-        <w:t xml:space="preserve">To investigate the effects of group and session on network-level PLI, a separate linear mixed-effects model was fitted for each combination of brain network and frequency band using the </w:t>
-      </w:r>
-      <w:r>
-        <w:rPr>
-          <w:rStyle w:val="VerbatimChar"/>
-        </w:rPr>
-        <w:t>statsmodels</w:t>
-      </w:r>
-      <w:r>
-        <w:t xml:space="preserve"> library.</w:t>
-      </w:r>
-    </w:p>
-    <w:p>
-      <w:pPr>
-        <w:pStyle w:val="BodyText"/>
-      </w:pPr>
-      <w:r>
-        <w:t>The model was specified as:</w:t>
-      </w:r>
-    </w:p>
-    <w:p>
-      <w:pPr>
-        <w:pStyle w:val="Compact"/>
-        <w:numPr>
-          <w:ilvl w:val="0"/>
-          <w:numId w:val="2"/>
-        </w:numPr>
-      </w:pPr>
-      <w:r>
-        <w:rPr>
-          <w:b/>
-          <w:bCs/>
-        </w:rPr>
-        <w:t>Dependent Variable</w:t>
-      </w:r>
-      <w:r>
-        <w:t xml:space="preserve">: </w:t>
-      </w:r>
-      <w:r>
-        <w:rPr>
-          <w:rStyle w:val="VerbatimChar"/>
-        </w:rPr>
-        <w:t>MeanPLI</w:t>
-      </w:r>
-    </w:p>
-    <w:p>
-      <w:pPr>
-        <w:pStyle w:val="Compact"/>
-        <w:numPr>
-          <w:ilvl w:val="0"/>
-          <w:numId w:val="2"/>
-        </w:numPr>
-      </w:pPr>
-      <w:r>
-        <w:rPr>
-          <w:b/>
-          <w:bCs/>
-        </w:rPr>
-        <w:t>Fixed Effects</w:t>
-      </w:r>
-      <w:r>
-        <w:t xml:space="preserve">: </w:t>
-      </w:r>
-      <w:r>
-        <w:rPr>
-          <w:rStyle w:val="VerbatimChar"/>
-        </w:rPr>
-        <w:t>Group</w:t>
-      </w:r>
-      <w:r>
-        <w:t xml:space="preserve">, </w:t>
-      </w:r>
-      <w:r>
-        <w:rPr>
-          <w:rStyle w:val="VerbatimChar"/>
-        </w:rPr>
-        <w:t>Session</w:t>
-      </w:r>
-      <w:r>
-        <w:t xml:space="preserve">, and the </w:t>
-      </w:r>
-      <w:r>
-        <w:rPr>
-          <w:rStyle w:val="VerbatimChar"/>
-        </w:rPr>
-        <w:t>Group * Session</w:t>
-      </w:r>
-      <w:r>
-        <w:t xml:space="preserve"> interaction term. When baseline adjustment was applied, the baseline PLI value (</w:t>
-      </w:r>
-      <w:r>
-        <w:rPr>
-          <w:rStyle w:val="VerbatimChar"/>
-        </w:rPr>
-        <w:t>PLI_Pre_Value</w:t>
-      </w:r>
-      <w:r>
-        <w:t>) was also included as a fixed-effect covariate.</w:t>
-      </w:r>
-    </w:p>
-    <w:p>
-      <w:pPr>
-        <w:pStyle w:val="Compact"/>
-        <w:numPr>
-          <w:ilvl w:val="0"/>
-          <w:numId w:val="2"/>
-        </w:numPr>
-      </w:pPr>
-      <w:r>
-        <w:rPr>
-          <w:b/>
-          <w:bCs/>
-        </w:rPr>
-        <w:t>Random Effect</w:t>
-      </w:r>
-      <w:r>
-        <w:t xml:space="preserve">: A random intercept was included for each </w:t>
-      </w:r>
-      <w:r>
-        <w:rPr>
-          <w:rStyle w:val="VerbatimChar"/>
-        </w:rPr>
-        <w:t>Participant</w:t>
-      </w:r>
-      <w:r>
-        <w:t xml:space="preserve"> to account for repeated measures and variability among individuals.</w:t>
-      </w:r>
-    </w:p>
-    <w:p>
-      <w:pPr>
-        <w:pStyle w:val="FirstParagraph"/>
-      </w:pPr>
       <w:r>
         <w:t xml:space="preserve">The model was fitted using the </w:t>
       </w:r>
@@ -279,7 +126,6 @@
           <w:b/>
           <w:bCs/>
         </w:rPr>
-        <w:lastRenderedPageBreak/>
         <w:t>Between-Group Contrasts</w:t>
       </w:r>
       <w:r>
@@ -341,7 +187,11 @@
         <w:pStyle w:val="FirstParagraph"/>
       </w:pPr>
       <w:r>
-        <w:t>The results of the analysis were visualized by generating line plots for each network and frequency band combination. These plots displayed the mean PLI values for each group across all sessions, with error bars representing the standard error of the mean (SE). Significance markers (</w:t>
+        <w:t xml:space="preserve">The results of the analysis were visualized by generating line plots for each network and frequency band combination. These plots displayed the mean PLI values for each group across all sessions, with error bars representing the standard error of the mean (SE). </w:t>
+      </w:r>
+      <w:r>
+        <w:lastRenderedPageBreak/>
+        <w:t>Significance markers (</w:t>
       </w:r>
       <w:r>
         <w:rPr>

</xml_diff>